<commit_message>
KOS-18 llms.txt: correzione di San Severino in produzione (24/10)
Co-Authored-By: Claude Opus 5.5 <noreply@anthropic.com>
Claude-Session: https://claude.ai/code/session_01Rr1X44gsg7BUwMzrRvYrc2
</commit_message>
<xml_diff>
--- a/docs/docx/sprint1-file-radice.docx
+++ b/docs/docx/sprint1-file-radice.docx
@@ -396,6 +396,33 @@
       </w:pPr>
       <w:r>
         <w:t xml:space="preserve">llms.txt pubblicato in produzione su entrambi i siti (bozza; sintesi da validare con KOS).</w:t>
+      </w:r>
+    </w:p>
+    <w:p>
+      <w:pPr>
+        <w:numPr>
+          <w:ilvl w:val="0"/>
+          <w:numId w:val="1002"/>
+        </w:numPr>
+        <w:pStyle w:val="Compact"/>
+      </w:pPr>
+      <w:r>
+        <w:t xml:space="preserve">24 ottobre: kosgroup.com, corretta in produzione la località malformata di San Severino («San Severino Marche, Taccoli (MC)»); copia precedente in</w:t>
+      </w:r>
+      <w:r>
+        <w:t xml:space="preserve"> </w:t>
+      </w:r>
+      <w:r>
+        <w:rPr>
+          <w:rStyle w:val="VerbatimChar"/>
+        </w:rPr>
+        <w:t xml:space="preserve">~/llms.txt.bak-20261024</w:t>
+      </w:r>
+      <w:r>
+        <w:t xml:space="preserve"> </w:t>
+      </w:r>
+      <w:r>
+        <w:t xml:space="preserve">sul cloud di produzione.</w:t>
       </w:r>
     </w:p>
     <w:p>

</xml_diff>

<commit_message>
AA llms.txt: numeri allineati alla home (oltre 50 residenze, hospice al plurale); testo considerato valido
Co-Authored-By: Claude Opus 5.5 <noreply@anthropic.com>
Claude-Session: https://claude.ai/code/session_01Rr1X44gsg7BUwMzrRvYrc2
</commit_message>
<xml_diff>
--- a/docs/docx/sprint1-file-radice.docx
+++ b/docs/docx/sprint1-file-radice.docx
@@ -396,6 +396,18 @@
       </w:pPr>
       <w:r>
         <w:t xml:space="preserve">llms.txt pubblicato in produzione su entrambi i siti (bozza; sintesi da validare con KOS).</w:t>
+      </w:r>
+    </w:p>
+    <w:p>
+      <w:pPr>
+        <w:numPr>
+          <w:ilvl w:val="0"/>
+          <w:numId w:val="1002"/>
+        </w:numPr>
+        <w:pStyle w:val="Compact"/>
+      </w:pPr>
+      <w:r>
+        <w:t xml:space="preserve">29 ottobre: testo considerato valido (sintesi tratte dai contenuti istituzionali dei siti; eventuali revisioni su richiesta di KOS o dell'agenzia). anniazzurri.it: «57 residenze… un hospice» sostituito con i numeri della home («oltre 50 residenze in 8 regioni», hospice al plurale: le pagine sono due).</w:t>
       </w:r>
     </w:p>
     <w:p>

</xml_diff>